<commit_message>
Lead the study brief with one distilled line per theme.
Keep the spoken quote underneath, and pull a second line only when it adds another claim.

Co-authored-by: choijunh-cloud <choijunh-cloud@users.noreply.github.com>
</commit_message>
<xml_diff>
--- a/lectures/오늘 학습/오늘학습.docx
+++ b/lectures/오늘 학습/오늘학습.docx
@@ -33,6 +33,751 @@
     <w:p>
       <w:pPr>
         <w:spacing w:after="80" w:before="80" w:line="276" w:lineRule="auto"/>
+      </w:pPr>
+      <w:r>
+        <w:rPr>
+          <w:rFonts w:ascii="맑은 고딕" w:hAnsi="맑은 고딕" w:eastAsia="맑은 고딕"/>
+          <w:b/>
+          <w:color w:val="0F2043"/>
+          <w:sz w:val="28"/>
+        </w:rPr>
+        <w:t>증류</w:t>
+      </w:r>
+    </w:p>
+    <w:p>
+      <w:pPr>
+        <w:spacing w:after="20" w:before="0" w:line="276" w:lineRule="auto"/>
+      </w:pPr>
+      <w:r>
+        <w:rPr>
+          <w:rFonts w:ascii="맑은 고딕" w:hAnsi="맑은 고딕" w:eastAsia="맑은 고딕"/>
+          <w:b/>
+          <w:color w:val="0F2043"/>
+          <w:sz w:val="22"/>
+        </w:rPr>
+        <w:t>1.  금리보다 그 위의 성장</w:t>
+      </w:r>
+    </w:p>
+    <w:p>
+      <w:pPr>
+        <w:spacing w:after="20" w:before="0" w:line="276" w:lineRule="auto"/>
+      </w:pPr>
+      <w:r>
+        <w:rPr>
+          <w:rFonts w:ascii="맑은 고딕" w:hAnsi="맑은 고딕" w:eastAsia="맑은 고딕"/>
+          <w:b w:val="0"/>
+          <w:color w:val="1A1A1A"/>
+          <w:sz w:val="22"/>
+        </w:rPr>
+        <w:t>금리의 레벨보단요 금리 이상의 성장이 나오느냐 안 나오냐 이게 더 중요한데 지금은 그걸 주도주들이 성장을 내고 있기 때문에 아직은 좀</w:t>
+      </w:r>
+    </w:p>
+    <w:p>
+      <w:pPr>
+        <w:spacing w:after="20" w:before="0" w:line="276" w:lineRule="auto"/>
+      </w:pPr>
+      <w:r>
+        <w:rPr>
+          <w:rFonts w:ascii="맑은 고딕" w:hAnsi="맑은 고딕" w:eastAsia="맑은 고딕"/>
+          <w:b w:val="0"/>
+          <w:color w:val="1A1A1A"/>
+          <w:sz w:val="21"/>
+        </w:rPr>
+        <w:t>·  그때 다 주가가 빠졌나요? 혁명기 때 다 오르잖아요 그래서 지금 올라가는 제일 큰 거는 사실 AI 투자 때문에 오르는게 제일 크고요</w:t>
+      </w:r>
+    </w:p>
+    <w:p>
+      <w:pPr>
+        <w:spacing w:after="20" w:before="0" w:line="276" w:lineRule="auto"/>
+      </w:pPr>
+      <w:r>
+        <w:rPr>
+          <w:rFonts w:ascii="맑은 고딕" w:hAnsi="맑은 고딕" w:eastAsia="맑은 고딕"/>
+          <w:b w:val="0"/>
+          <w:color w:val="1A1A1A"/>
+          <w:sz w:val="21"/>
+        </w:rPr>
+        <w:t>·  원래 70% 확률이었는데 오늘 그 뉴욕 연준의 그 윌리엄스</w:t>
+      </w:r>
+    </w:p>
+    <w:p>
+      <w:pPr>
+        <w:spacing w:after="40" w:before="0" w:line="276" w:lineRule="auto"/>
+      </w:pPr>
+      <w:r>
+        <w:rPr>
+          <w:rFonts w:ascii="맑은 고딕" w:hAnsi="맑은 고딕" w:eastAsia="맑은 고딕"/>
+          <w:b w:val="0"/>
+          <w:color w:val="1A1A1A"/>
+          <w:sz w:val="12"/>
+        </w:rPr>
+      </w:r>
+    </w:p>
+    <w:p>
+      <w:pPr>
+        <w:spacing w:after="20" w:before="0" w:line="276" w:lineRule="auto"/>
+      </w:pPr>
+      <w:r>
+        <w:rPr>
+          <w:rFonts w:ascii="맑은 고딕" w:hAnsi="맑은 고딕" w:eastAsia="맑은 고딕"/>
+          <w:b/>
+          <w:color w:val="0F2043"/>
+          <w:sz w:val="22"/>
+        </w:rPr>
+        <w:t>2.  유가가 풀리면 금리와 주식이 따라온다</w:t>
+      </w:r>
+    </w:p>
+    <w:p>
+      <w:pPr>
+        <w:spacing w:after="20" w:before="0" w:line="276" w:lineRule="auto"/>
+      </w:pPr>
+      <w:r>
+        <w:rPr>
+          <w:rFonts w:ascii="맑은 고딕" w:hAnsi="맑은 고딕" w:eastAsia="맑은 고딕"/>
+          <w:b w:val="0"/>
+          <w:color w:val="1A1A1A"/>
+          <w:sz w:val="22"/>
+        </w:rPr>
+        <w:t>결국에는 유가가 안정화되면 금리가 안정화되고</w:t>
+      </w:r>
+    </w:p>
+    <w:p>
+      <w:pPr>
+        <w:spacing w:after="40" w:before="0" w:line="276" w:lineRule="auto"/>
+      </w:pPr>
+      <w:r>
+        <w:rPr>
+          <w:rFonts w:ascii="맑은 고딕" w:hAnsi="맑은 고딕" w:eastAsia="맑은 고딕"/>
+          <w:b w:val="0"/>
+          <w:color w:val="1A1A1A"/>
+          <w:sz w:val="12"/>
+        </w:rPr>
+      </w:r>
+    </w:p>
+    <w:p>
+      <w:pPr>
+        <w:spacing w:after="20" w:before="0" w:line="276" w:lineRule="auto"/>
+      </w:pPr>
+      <w:r>
+        <w:rPr>
+          <w:rFonts w:ascii="맑은 고딕" w:hAnsi="맑은 고딕" w:eastAsia="맑은 고딕"/>
+          <w:b/>
+          <w:color w:val="0F2043"/>
+          <w:sz w:val="22"/>
+        </w:rPr>
+        <w:t>3.  외국인은 팔고 장비와 대형주가 버틴다</w:t>
+      </w:r>
+    </w:p>
+    <w:p>
+      <w:pPr>
+        <w:spacing w:after="20" w:before="0" w:line="276" w:lineRule="auto"/>
+      </w:pPr>
+      <w:r>
+        <w:rPr>
+          <w:rFonts w:ascii="맑은 고딕" w:hAnsi="맑은 고딕" w:eastAsia="맑은 고딕"/>
+          <w:b w:val="0"/>
+          <w:color w:val="1A1A1A"/>
+          <w:sz w:val="22"/>
+        </w:rPr>
+        <w:t>삼성전자가 배당락을 이겨내며 저가 매수세가 유입됐고요 코스닥은 반도체 소부장 기업들의 수급이 강하게 유입되고 일부 시가 총액 상위</w:t>
+      </w:r>
+    </w:p>
+    <w:p>
+      <w:pPr>
+        <w:spacing w:after="20" w:before="0" w:line="276" w:lineRule="auto"/>
+      </w:pPr>
+      <w:r>
+        <w:rPr>
+          <w:rFonts w:ascii="맑은 고딕" w:hAnsi="맑은 고딕" w:eastAsia="맑은 고딕"/>
+          <w:b w:val="0"/>
+          <w:color w:val="1A1A1A"/>
+          <w:sz w:val="21"/>
+        </w:rPr>
+        <w:t>·  오늘 장초반에 외국인이 조금이나마 사 주는 모습이 있었기 때문에 오늘은 매수해 주지 않을까 했는데 1조 넘는 매도세 조단위 매도세가</w:t>
+      </w:r>
+    </w:p>
+    <w:p>
+      <w:pPr>
+        <w:spacing w:after="20" w:before="0" w:line="276" w:lineRule="auto"/>
+      </w:pPr>
+      <w:r>
+        <w:rPr>
+          <w:rFonts w:ascii="맑은 고딕" w:hAnsi="맑은 고딕" w:eastAsia="맑은 고딕"/>
+          <w:b w:val="0"/>
+          <w:color w:val="1A1A1A"/>
+          <w:sz w:val="21"/>
+        </w:rPr>
+        <w:t>·  지는 방향을 아예 못 잡고 있는 6,500과 7천 사이에서 계속 좀 갇혀 있는 좀 그런 모습인 거 같습니다</w:t>
+      </w:r>
+    </w:p>
+    <w:p>
+      <w:pPr>
+        <w:spacing w:after="40" w:before="0" w:line="276" w:lineRule="auto"/>
+      </w:pPr>
+      <w:r>
+        <w:rPr>
+          <w:rFonts w:ascii="맑은 고딕" w:hAnsi="맑은 고딕" w:eastAsia="맑은 고딕"/>
+          <w:b w:val="0"/>
+          <w:color w:val="1A1A1A"/>
+          <w:sz w:val="12"/>
+        </w:rPr>
+      </w:r>
+    </w:p>
+    <w:p>
+      <w:pPr>
+        <w:spacing w:after="20" w:before="0" w:line="276" w:lineRule="auto"/>
+      </w:pPr>
+      <w:r>
+        <w:rPr>
+          <w:rFonts w:ascii="맑은 고딕" w:hAnsi="맑은 고딕" w:eastAsia="맑은 고딕"/>
+          <w:b/>
+          <w:color w:val="0F2043"/>
+          <w:sz w:val="22"/>
+        </w:rPr>
+        <w:t>4.  빨리 가자는 경쟁과 늦추자는 경고가 같이 있다</w:t>
+      </w:r>
+    </w:p>
+    <w:p>
+      <w:pPr>
+        <w:spacing w:after="20" w:before="0" w:line="276" w:lineRule="auto"/>
+      </w:pPr>
+      <w:r>
+        <w:rPr>
+          <w:rFonts w:ascii="맑은 고딕" w:hAnsi="맑은 고딕" w:eastAsia="맑은 고딕"/>
+          <w:b w:val="0"/>
+          <w:color w:val="1A1A1A"/>
+          <w:sz w:val="22"/>
+        </w:rPr>
+        <w:t>결국 지금 AI 산업에서는 더 빨리 가야한다는 경쟁과 속도를 조절해야 한다는 경고가 동시에 나오고 있습니다</w:t>
+      </w:r>
+    </w:p>
+    <w:p>
+      <w:pPr>
+        <w:spacing w:after="20" w:before="0" w:line="276" w:lineRule="auto"/>
+      </w:pPr>
+      <w:r>
+        <w:rPr>
+          <w:rFonts w:ascii="맑은 고딕" w:hAnsi="맑은 고딕" w:eastAsia="맑은 고딕"/>
+          <w:b w:val="0"/>
+          <w:color w:val="1A1A1A"/>
+          <w:sz w:val="21"/>
+        </w:rPr>
+        <w:t>·  소식부터 보죠 AI 속도 조절론을 말한 것과 한반대로 국직한 신제품들을 쏟아냈습니다.이 특히 새 AI 에이전트 다치가 집중 조명을</w:t>
+      </w:r>
+    </w:p>
+    <w:p>
+      <w:pPr>
+        <w:spacing w:after="20" w:before="0" w:line="276" w:lineRule="auto"/>
+      </w:pPr>
+      <w:r>
+        <w:rPr>
+          <w:rFonts w:ascii="맑은 고딕" w:hAnsi="맑은 고딕" w:eastAsia="맑은 고딕"/>
+          <w:b w:val="0"/>
+          <w:color w:val="1A1A1A"/>
+          <w:sz w:val="21"/>
+        </w:rPr>
+        <w:t>·  연예 개발자 회의에서 새로운 AI 에이전트 다스를 공개했습니다</w:t>
+      </w:r>
+    </w:p>
+    <w:p>
+      <w:pPr>
+        <w:spacing w:after="40" w:before="0" w:line="276" w:lineRule="auto"/>
+      </w:pPr>
+      <w:r>
+        <w:rPr>
+          <w:rFonts w:ascii="맑은 고딕" w:hAnsi="맑은 고딕" w:eastAsia="맑은 고딕"/>
+          <w:b w:val="0"/>
+          <w:color w:val="1A1A1A"/>
+          <w:sz w:val="12"/>
+        </w:rPr>
+      </w:r>
+    </w:p>
+    <w:p>
+      <w:pPr>
+        <w:spacing w:after="20" w:before="0" w:line="276" w:lineRule="auto"/>
+      </w:pPr>
+      <w:r>
+        <w:rPr>
+          <w:rFonts w:ascii="맑은 고딕" w:hAnsi="맑은 고딕" w:eastAsia="맑은 고딕"/>
+          <w:b/>
+          <w:color w:val="0F2043"/>
+          <w:sz w:val="22"/>
+        </w:rPr>
+        <w:t>5.  메모리는 아직 사이클, 차가운 가격은 수급</w:t>
+      </w:r>
+    </w:p>
+    <w:p>
+      <w:pPr>
+        <w:spacing w:after="20" w:before="0" w:line="276" w:lineRule="auto"/>
+      </w:pPr>
+      <w:r>
+        <w:rPr>
+          <w:rFonts w:ascii="맑은 고딕" w:hAnsi="맑은 고딕" w:eastAsia="맑은 고딕"/>
+          <w:b w:val="0"/>
+          <w:color w:val="1A1A1A"/>
+          <w:sz w:val="22"/>
+        </w:rPr>
+        <w:t>두 회사 모두 지금 너무 없어서 못 팔고 좋은데 시장에서만 너무 냉담한 거니까 이게 수급상의 문제가 아니냐 이런 얘기들을 계속 하는 거죠</w:t>
+      </w:r>
+    </w:p>
+    <w:p>
+      <w:pPr>
+        <w:spacing w:after="20" w:before="0" w:line="276" w:lineRule="auto"/>
+      </w:pPr>
+      <w:r>
+        <w:rPr>
+          <w:rFonts w:ascii="맑은 고딕" w:hAnsi="맑은 고딕" w:eastAsia="맑은 고딕"/>
+          <w:b w:val="0"/>
+          <w:color w:val="1A1A1A"/>
+          <w:sz w:val="21"/>
+        </w:rPr>
+        <w:t>·  이거는 이제 메모리에 대한 이게 사이클 산업이냐라는 논쟁인데 이번 실적으로</w:t>
+      </w:r>
+    </w:p>
+    <w:p>
+      <w:pPr>
+        <w:spacing w:after="20" w:before="0" w:line="276" w:lineRule="auto"/>
+      </w:pPr>
+      <w:r>
+        <w:rPr>
+          <w:rFonts w:ascii="맑은 고딕" w:hAnsi="맑은 고딕" w:eastAsia="맑은 고딕"/>
+          <w:b w:val="0"/>
+          <w:color w:val="1A1A1A"/>
+          <w:sz w:val="21"/>
+        </w:rPr>
+        <w:t>·  아직 그 어 미국 사람들이나 투자자들은 그 로직 반도체랑 메모리를 메모리를 거의 천민 취급하고 있습니다</w:t>
+      </w:r>
+    </w:p>
+    <w:p>
+      <w:pPr>
+        <w:spacing w:after="40" w:before="0" w:line="276" w:lineRule="auto"/>
+      </w:pPr>
+      <w:r>
+        <w:rPr>
+          <w:rFonts w:ascii="맑은 고딕" w:hAnsi="맑은 고딕" w:eastAsia="맑은 고딕"/>
+          <w:b w:val="0"/>
+          <w:color w:val="1A1A1A"/>
+          <w:sz w:val="12"/>
+        </w:rPr>
+      </w:r>
+    </w:p>
+    <w:p>
+      <w:pPr>
+        <w:spacing w:after="20" w:before="0" w:line="276" w:lineRule="auto"/>
+      </w:pPr>
+      <w:r>
+        <w:rPr>
+          <w:rFonts w:ascii="맑은 고딕" w:hAnsi="맑은 고딕" w:eastAsia="맑은 고딕"/>
+          <w:b/>
+          <w:color w:val="0F2043"/>
+          <w:sz w:val="22"/>
+        </w:rPr>
+        <w:t>6.  잘해도 업황, 못해도 몫을 나눈다</w:t>
+      </w:r>
+    </w:p>
+    <w:p>
+      <w:pPr>
+        <w:spacing w:after="20" w:before="0" w:line="276" w:lineRule="auto"/>
+      </w:pPr>
+      <w:r>
+        <w:rPr>
+          <w:rFonts w:ascii="맑은 고딕" w:hAnsi="맑은 고딕" w:eastAsia="맑은 고딕"/>
+          <w:b w:val="0"/>
+          <w:color w:val="1A1A1A"/>
+          <w:sz w:val="22"/>
+        </w:rPr>
+        <w:t>이제는 키가 HBM으로 넘어갔다</w:t>
+      </w:r>
+    </w:p>
+    <w:p>
+      <w:pPr>
+        <w:spacing w:after="20" w:before="0" w:line="276" w:lineRule="auto"/>
+      </w:pPr>
+      <w:r>
+        <w:rPr>
+          <w:rFonts w:ascii="맑은 고딕" w:hAnsi="맑은 고딕" w:eastAsia="맑은 고딕"/>
+          <w:b w:val="0"/>
+          <w:color w:val="1A1A1A"/>
+          <w:sz w:val="21"/>
+        </w:rPr>
+        <w:t>·  생산은 양상과 수율이라는 부분이 가장 중요하거든요</w:t>
+      </w:r>
+    </w:p>
+    <w:p>
+      <w:pPr>
+        <w:spacing w:after="20" w:before="0" w:line="276" w:lineRule="auto"/>
+      </w:pPr>
+      <w:r>
+        <w:rPr>
+          <w:rFonts w:ascii="맑은 고딕" w:hAnsi="맑은 고딕" w:eastAsia="맑은 고딕"/>
+          <w:b w:val="0"/>
+          <w:color w:val="1A1A1A"/>
+          <w:sz w:val="21"/>
+        </w:rPr>
+        <w:t>·  삼성전자 하이스는 반대 급가 오히려 더 많을 겁니다</w:t>
+      </w:r>
+    </w:p>
+    <w:p>
+      <w:pPr>
+        <w:spacing w:after="40" w:before="0" w:line="276" w:lineRule="auto"/>
+      </w:pPr>
+      <w:r>
+        <w:rPr>
+          <w:rFonts w:ascii="맑은 고딕" w:hAnsi="맑은 고딕" w:eastAsia="맑은 고딕"/>
+          <w:b w:val="0"/>
+          <w:color w:val="1A1A1A"/>
+          <w:sz w:val="12"/>
+        </w:rPr>
+      </w:r>
+    </w:p>
+    <w:p>
+      <w:pPr>
+        <w:spacing w:after="20" w:before="0" w:line="276" w:lineRule="auto"/>
+      </w:pPr>
+      <w:r>
+        <w:rPr>
+          <w:rFonts w:ascii="맑은 고딕" w:hAnsi="맑은 고딕" w:eastAsia="맑은 고딕"/>
+          <w:b/>
+          <w:color w:val="0F2043"/>
+          <w:sz w:val="22"/>
+        </w:rPr>
+        <w:t>7.  전통 사이클 배수와 장기 계약 배수</w:t>
+      </w:r>
+    </w:p>
+    <w:p>
+      <w:pPr>
+        <w:spacing w:after="20" w:before="0" w:line="276" w:lineRule="auto"/>
+      </w:pPr>
+      <w:r>
+        <w:rPr>
+          <w:rFonts w:ascii="맑은 고딕" w:hAnsi="맑은 고딕" w:eastAsia="맑은 고딕"/>
+          <w:b w:val="0"/>
+          <w:color w:val="1A1A1A"/>
+          <w:sz w:val="22"/>
+        </w:rPr>
+        <w:t>빅테크 기업에 공급하는 B2B 가격이거든요 그니까 B2B 가격의 장기 계약이라고 하면 우리가 교과서적으로 얘기하면 PER 평가가 맞아요</w:t>
+      </w:r>
+    </w:p>
+    <w:p>
+      <w:pPr>
+        <w:spacing w:after="20" w:before="0" w:line="276" w:lineRule="auto"/>
+      </w:pPr>
+      <w:r>
+        <w:rPr>
+          <w:rFonts w:ascii="맑은 고딕" w:hAnsi="맑은 고딕" w:eastAsia="맑은 고딕"/>
+          <w:b w:val="0"/>
+          <w:color w:val="1A1A1A"/>
+          <w:sz w:val="21"/>
+        </w:rPr>
+        <w:t>·  과거에 우리가 어 PBR 기준에서 PER 기준으로 넘어갈 수 있다라고 봤을 때는 장기 계약이 우선 선형이었거든요</w:t>
+      </w:r>
+    </w:p>
+    <w:p>
+      <w:pPr>
+        <w:spacing w:after="20" w:before="0" w:line="276" w:lineRule="auto"/>
+      </w:pPr>
+      <w:r>
+        <w:rPr>
+          <w:rFonts w:ascii="맑은 고딕" w:hAnsi="맑은 고딕" w:eastAsia="맑은 고딕"/>
+          <w:b w:val="0"/>
+          <w:color w:val="1A1A1A"/>
+          <w:sz w:val="21"/>
+        </w:rPr>
+        <w:t>·  하느냐 우리가 요즘에 유행하는 뉴노멀로 평가를 하느냐 이제 거기에 달려 있는 거죠</w:t>
+      </w:r>
+    </w:p>
+    <w:p>
+      <w:pPr>
+        <w:spacing w:after="40" w:before="0" w:line="276" w:lineRule="auto"/>
+      </w:pPr>
+      <w:r>
+        <w:rPr>
+          <w:rFonts w:ascii="맑은 고딕" w:hAnsi="맑은 고딕" w:eastAsia="맑은 고딕"/>
+          <w:b w:val="0"/>
+          <w:color w:val="1A1A1A"/>
+          <w:sz w:val="12"/>
+        </w:rPr>
+      </w:r>
+    </w:p>
+    <w:p>
+      <w:pPr>
+        <w:spacing w:after="20" w:before="0" w:line="276" w:lineRule="auto"/>
+      </w:pPr>
+      <w:r>
+        <w:rPr>
+          <w:rFonts w:ascii="맑은 고딕" w:hAnsi="맑은 고딕" w:eastAsia="맑은 고딕"/>
+          <w:b/>
+          <w:color w:val="0F2043"/>
+          <w:sz w:val="22"/>
+        </w:rPr>
+        <w:t>8.  채권을 찍는 동안은 경고가 아니다</w:t>
+      </w:r>
+    </w:p>
+    <w:p>
+      <w:pPr>
+        <w:spacing w:after="20" w:before="0" w:line="276" w:lineRule="auto"/>
+      </w:pPr>
+      <w:r>
+        <w:rPr>
+          <w:rFonts w:ascii="맑은 고딕" w:hAnsi="맑은 고딕" w:eastAsia="맑은 고딕"/>
+          <w:b w:val="0"/>
+          <w:color w:val="1A1A1A"/>
+          <w:sz w:val="22"/>
+        </w:rPr>
+        <w:t>구글이 이제 100년 채권을 발행하기는 했지만 지금 하이퍼스케드 기업들의 자금 조달 방식은 정상적인 채권 발행입니다</w:t>
+      </w:r>
+    </w:p>
+    <w:p>
+      <w:pPr>
+        <w:spacing w:after="20" w:before="0" w:line="276" w:lineRule="auto"/>
+      </w:pPr>
+      <w:r>
+        <w:rPr>
+          <w:rFonts w:ascii="맑은 고딕" w:hAnsi="맑은 고딕" w:eastAsia="맑은 고딕"/>
+          <w:b w:val="0"/>
+          <w:color w:val="1A1A1A"/>
+          <w:sz w:val="21"/>
+        </w:rPr>
+        <w:t>·  다컴 버블 때 기업들이 돈을 끌어오다가 더 이상 이제 채권 발행이 안 되면서 우리로 얘기하면 흔히 사체를 끌어왔거든요</w:t>
+      </w:r>
+    </w:p>
+    <w:p>
+      <w:pPr>
+        <w:spacing w:after="20" w:before="0" w:line="276" w:lineRule="auto"/>
+      </w:pPr>
+      <w:r>
+        <w:rPr>
+          <w:rFonts w:ascii="맑은 고딕" w:hAnsi="맑은 고딕" w:eastAsia="맑은 고딕"/>
+          <w:b w:val="0"/>
+          <w:color w:val="1A1A1A"/>
+          <w:sz w:val="21"/>
+        </w:rPr>
+        <w:t>·  CDS 프리미엄이 뭐 사상 최고치다 오라클 같은 애들 부러지면 어떻해 이렇게 하잖아요</w:t>
+      </w:r>
+    </w:p>
+    <w:p>
+      <w:pPr>
+        <w:spacing w:after="40" w:before="0" w:line="276" w:lineRule="auto"/>
+      </w:pPr>
+      <w:r>
+        <w:rPr>
+          <w:rFonts w:ascii="맑은 고딕" w:hAnsi="맑은 고딕" w:eastAsia="맑은 고딕"/>
+          <w:b w:val="0"/>
+          <w:color w:val="1A1A1A"/>
+          <w:sz w:val="12"/>
+        </w:rPr>
+      </w:r>
+    </w:p>
+    <w:p>
+      <w:pPr>
+        <w:spacing w:after="20" w:before="0" w:line="276" w:lineRule="auto"/>
+      </w:pPr>
+      <w:r>
+        <w:rPr>
+          <w:rFonts w:ascii="맑은 고딕" w:hAnsi="맑은 고딕" w:eastAsia="맑은 고딕"/>
+          <w:b/>
+          <w:color w:val="0F2043"/>
+          <w:sz w:val="22"/>
+        </w:rPr>
+        <w:t>9.  장비는 앞서고 소재는 늦다</w:t>
+      </w:r>
+    </w:p>
+    <w:p>
+      <w:pPr>
+        <w:spacing w:after="20" w:before="0" w:line="276" w:lineRule="auto"/>
+      </w:pPr>
+      <w:r>
+        <w:rPr>
+          <w:rFonts w:ascii="맑은 고딕" w:hAnsi="맑은 고딕" w:eastAsia="맑은 고딕"/>
+          <w:b w:val="0"/>
+          <w:color w:val="1A1A1A"/>
+          <w:sz w:val="22"/>
+        </w:rPr>
+        <w:t>사이클에서도 소재 로테이션을 판단하려면 디램과 랜드 가격보다는 기존의 패 가동률과 신규 생산이 커지는지를 확인하라고 조언했습니다 LS</w:t>
+      </w:r>
+    </w:p>
+    <w:p>
+      <w:pPr>
+        <w:spacing w:after="20" w:before="0" w:line="276" w:lineRule="auto"/>
+      </w:pPr>
+      <w:r>
+        <w:rPr>
+          <w:rFonts w:ascii="맑은 고딕" w:hAnsi="맑은 고딕" w:eastAsia="맑은 고딕"/>
+          <w:b w:val="0"/>
+          <w:color w:val="1A1A1A"/>
+          <w:sz w:val="21"/>
+        </w:rPr>
+        <w:t>·  보통 장비주의 선행 상승 이후에 소재가 빠르게 따라붙기 시작하는데요 이번 사이클에서도 소재 로테이션을 판단하려면 디램과 랜드 가격보다는</w:t>
+      </w:r>
+    </w:p>
+    <w:p>
+      <w:pPr>
+        <w:spacing w:after="20" w:before="0" w:line="276" w:lineRule="auto"/>
+      </w:pPr>
+      <w:r>
+        <w:rPr>
+          <w:rFonts w:ascii="맑은 고딕" w:hAnsi="맑은 고딕" w:eastAsia="맑은 고딕"/>
+          <w:b w:val="0"/>
+          <w:color w:val="1A1A1A"/>
+          <w:sz w:val="21"/>
+        </w:rPr>
+        <w:t>·  반도체 그린필드 투자 규모가 얼마나 더 오래 확대되는지를 봐야 한다고 밝혔습니다</w:t>
+      </w:r>
+    </w:p>
+    <w:p>
+      <w:pPr>
+        <w:spacing w:after="40" w:before="0" w:line="276" w:lineRule="auto"/>
+      </w:pPr>
+      <w:r>
+        <w:rPr>
+          <w:rFonts w:ascii="맑은 고딕" w:hAnsi="맑은 고딕" w:eastAsia="맑은 고딕"/>
+          <w:b w:val="0"/>
+          <w:color w:val="1A1A1A"/>
+          <w:sz w:val="12"/>
+        </w:rPr>
+      </w:r>
+    </w:p>
+    <w:p>
+      <w:pPr>
+        <w:spacing w:after="20" w:before="0" w:line="276" w:lineRule="auto"/>
+      </w:pPr>
+      <w:r>
+        <w:rPr>
+          <w:rFonts w:ascii="맑은 고딕" w:hAnsi="맑은 고딕" w:eastAsia="맑은 고딕"/>
+          <w:b/>
+          <w:color w:val="0F2043"/>
+          <w:sz w:val="22"/>
+        </w:rPr>
+        <w:t>10.  박스에선 주도주를 버틴다</w:t>
+      </w:r>
+    </w:p>
+    <w:p>
+      <w:pPr>
+        <w:spacing w:after="20" w:before="0" w:line="276" w:lineRule="auto"/>
+      </w:pPr>
+      <w:r>
+        <w:rPr>
+          <w:rFonts w:ascii="맑은 고딕" w:hAnsi="맑은 고딕" w:eastAsia="맑은 고딕"/>
+          <w:b w:val="0"/>
+          <w:color w:val="1A1A1A"/>
+          <w:sz w:val="22"/>
+        </w:rPr>
+        <w:t>오를 때 매수하고 내려갈 때 손절하면 그 업박지 한 세 번 정도를 타시면 거의 그냥 멘탈이 나갑니다</w:t>
+      </w:r>
+    </w:p>
+    <w:p>
+      <w:pPr>
+        <w:spacing w:after="20" w:before="0" w:line="276" w:lineRule="auto"/>
+      </w:pPr>
+      <w:r>
+        <w:rPr>
+          <w:rFonts w:ascii="맑은 고딕" w:hAnsi="맑은 고딕" w:eastAsia="맑은 고딕"/>
+          <w:b w:val="0"/>
+          <w:color w:val="1A1A1A"/>
+          <w:sz w:val="21"/>
+        </w:rPr>
+        <w:t>·  투입해야 되냐면 190만 원대를 돌파하고 나서 매수하시는게 더 나아 조금 더 비싸게 사시지만 매물대를 넘겨서 오히려 매수를 하시는게</w:t>
+      </w:r>
+    </w:p>
+    <w:p>
+      <w:pPr>
+        <w:spacing w:after="20" w:before="0" w:line="276" w:lineRule="auto"/>
+      </w:pPr>
+      <w:r>
+        <w:rPr>
+          <w:rFonts w:ascii="맑은 고딕" w:hAnsi="맑은 고딕" w:eastAsia="맑은 고딕"/>
+          <w:b w:val="0"/>
+          <w:color w:val="1A1A1A"/>
+          <w:sz w:val="21"/>
+        </w:rPr>
+        <w:t>·  이게 엇박자라는 것은 반도체와 시장과의 엇박자도 있고 또 하나는 오늘 같은 경우를 보더라도 삼성전자는 1% 하락을 하고 SK 하이닉스는</w:t>
+      </w:r>
+    </w:p>
+    <w:p>
+      <w:pPr>
+        <w:spacing w:after="40" w:before="0" w:line="276" w:lineRule="auto"/>
+      </w:pPr>
+      <w:r>
+        <w:rPr>
+          <w:rFonts w:ascii="맑은 고딕" w:hAnsi="맑은 고딕" w:eastAsia="맑은 고딕"/>
+          <w:b w:val="0"/>
+          <w:color w:val="1A1A1A"/>
+          <w:sz w:val="12"/>
+        </w:rPr>
+      </w:r>
+    </w:p>
+    <w:p>
+      <w:pPr>
+        <w:spacing w:after="20" w:before="0" w:line="276" w:lineRule="auto"/>
+      </w:pPr>
+      <w:r>
+        <w:rPr>
+          <w:rFonts w:ascii="맑은 고딕" w:hAnsi="맑은 고딕" w:eastAsia="맑은 고딕"/>
+          <w:b/>
+          <w:color w:val="0F2043"/>
+          <w:sz w:val="22"/>
+        </w:rPr>
+        <w:t>11.  개별 호재는 증설과 수주가 보일 때</w:t>
+      </w:r>
+    </w:p>
+    <w:p>
+      <w:pPr>
+        <w:spacing w:after="20" w:before="0" w:line="276" w:lineRule="auto"/>
+      </w:pPr>
+      <w:r>
+        <w:rPr>
+          <w:rFonts w:ascii="맑은 고딕" w:hAnsi="맑은 고딕" w:eastAsia="맑은 고딕"/>
+          <w:b w:val="0"/>
+          <w:color w:val="1A1A1A"/>
+          <w:sz w:val="22"/>
+        </w:rPr>
+        <w:t>한미반도체가 반도체 장비 수주 소식을 공개하면서 상승 마감했습니다 한미 반도체는 싱가포르 반도체 후공정 전문 기업이죠 UTC의 태국</w:t>
+      </w:r>
+    </w:p>
+    <w:p>
+      <w:pPr>
+        <w:spacing w:after="20" w:before="0" w:line="276" w:lineRule="auto"/>
+      </w:pPr>
+      <w:r>
+        <w:rPr>
+          <w:rFonts w:ascii="맑은 고딕" w:hAnsi="맑은 고딕" w:eastAsia="맑은 고딕"/>
+          <w:b w:val="0"/>
+          <w:color w:val="1A1A1A"/>
+          <w:sz w:val="21"/>
+        </w:rPr>
+        <w:t>·  삼성전기가 국내외 기판 생산 거점에 6조원대 투자를 진행한다는 소식이 전해지면서 주가가 상승했습니다 앞서 삼성전기는 국내 세종 사업</w:t>
+      </w:r>
+    </w:p>
+    <w:p>
+      <w:pPr>
+        <w:spacing w:after="20" w:before="0" w:line="276" w:lineRule="auto"/>
+      </w:pPr>
+      <w:r>
+        <w:rPr>
+          <w:rFonts w:ascii="맑은 고딕" w:hAnsi="맑은 고딕" w:eastAsia="맑은 고딕"/>
+          <w:b w:val="0"/>
+          <w:color w:val="1A1A1A"/>
+          <w:sz w:val="21"/>
+        </w:rPr>
+        <w:t>·  11%대 말씀드린 한미 반도체도 7.46% 46%대 오르면서 장을 마쳤습니다 HLB 그룹 관련주들이 이틀째 급등세를 이어갔습니다</w:t>
+      </w:r>
+    </w:p>
+    <w:p>
+      <w:pPr>
+        <w:spacing w:after="40" w:before="0" w:line="276" w:lineRule="auto"/>
+      </w:pPr>
+      <w:r>
+        <w:rPr>
+          <w:rFonts w:ascii="맑은 고딕" w:hAnsi="맑은 고딕" w:eastAsia="맑은 고딕"/>
+          <w:b w:val="0"/>
+          <w:color w:val="1A1A1A"/>
+          <w:sz w:val="12"/>
+        </w:rPr>
+      </w:r>
+    </w:p>
+    <w:p>
+      <w:pPr>
+        <w:spacing w:after="80" w:before="160" w:line="276" w:lineRule="auto"/>
       </w:pPr>
       <w:r>
         <w:rPr>
@@ -124,7 +869,7 @@
                 <w:color w:val="FFFFFF"/>
                 <w:sz w:val="18"/>
               </w:rPr>
-              <w:t>화자가 미는 말</w:t>
+              <w:t>증류한 말</w:t>
             </w:r>
           </w:p>
         </w:tc>
@@ -195,7 +940,7 @@
                 <w:color w:val="1A1A1A"/>
                 <w:sz w:val="17"/>
               </w:rPr>
-              <w:t>중요한 거는 금리의 레벨보단요 금리 이상의 성장이 나오느냐 안 나오냐 이게 더 중요한데 지금은 그걸 주도주들이 성장을 내고 있기 때문에 아직은 좀 견조하다 이렇게 봐야 될 것 같습니다</w:t>
+              <w:t>금리의 레벨보단요 금리 이상의 성장이 나오느냐 안 나오냐 이게 더 중요한데 지금은 그걸 주도주들이 성장을 내고 있기 때문에 아직은 좀</w:t>
             </w:r>
           </w:p>
         </w:tc>
@@ -266,7 +1011,7 @@
                 <w:color w:val="1A1A1A"/>
                 <w:sz w:val="17"/>
               </w:rPr>
-              <w:t>결국에는 유가가 안정화되면 금리가 안정화되고 그리고 주식 시장이 반등이 가능할 수 있다는 걸 다시 한번 확인할 수 있었던 장이었습니다</w:t>
+              <w:t>결국에는 유가가 안정화되면 금리가 안정화되고</w:t>
             </w:r>
           </w:p>
         </w:tc>
@@ -337,7 +1082,7 @@
                 <w:color w:val="1A1A1A"/>
                 <w:sz w:val="17"/>
               </w:rPr>
-              <w:t>하지만 삼성전자가 배당락을 이겨내며 저가 매수세가 유입됐고요 코스닥은 반도체 소부장 기업들의 수급이 강하게 유입되고 일부 시가 총액 상위 종목들 헬스케어 대표주가 선방하면서 지수 양전에</w:t>
+              <w:t>삼성전자가 배당락을 이겨내며 저가 매수세가 유입됐고요 코스닥은 반도체 소부장 기업들의 수급이 강하게 유입되고 일부 시가 총액 상위</w:t>
             </w:r>
           </w:p>
         </w:tc>
@@ -479,7 +1224,7 @@
                 <w:color w:val="1A1A1A"/>
                 <w:sz w:val="17"/>
               </w:rPr>
-              <w:t>보면 두 회사 모두 지금 너무 없어서 못 팔고 좋은데 시장에서만 너무 냉담한 거니까 이게 수급상의 문제가 아니냐 이런 얘기들을 계속 하는 거죠</w:t>
+              <w:t>두 회사 모두 지금 너무 없어서 못 팔고 좋은데 시장에서만 너무 냉담한 거니까 이게 수급상의 문제가 아니냐 이런 얘기들을 계속 하는 거죠</w:t>
             </w:r>
           </w:p>
         </w:tc>
@@ -550,7 +1295,7 @@
                 <w:color w:val="1A1A1A"/>
                 <w:sz w:val="17"/>
               </w:rPr>
-              <w:t>이제는 키포인트가 HBM이라고 보세요 왜냐면 그동안 가격 상승을 이끌었던 건 최근에는 사실 범용 쪽이었고 범용 잘하는 친구들이 실적 쭉쭉 당겼었잖아요 근데 이제는 키가 HBM으로 넘어갔다</w:t>
+              <w:t>이제는 키가 HBM으로 넘어갔다</w:t>
             </w:r>
           </w:p>
         </w:tc>
@@ -621,7 +1366,7 @@
                 <w:color w:val="1A1A1A"/>
                 <w:sz w:val="17"/>
               </w:rPr>
-              <w:t>아니라 빅테크 기업에 공급하는 B2B 가격이거든요 그니까 B2B 가격의 장기 계약이라고 하면 우리가 교과서적으로 얘기하면 PER 평가가 맞아요</w:t>
+              <w:t>빅테크 기업에 공급하는 B2B 가격이거든요 그니까 B2B 가격의 장기 계약이라고 하면 우리가 교과서적으로 얘기하면 PER 평가가 맞아요</w:t>
             </w:r>
           </w:p>
         </w:tc>
@@ -692,7 +1437,7 @@
                 <w:color w:val="1A1A1A"/>
                 <w:sz w:val="17"/>
               </w:rPr>
-              <w:t>돈을 빌리는데 문제가 생기면 다컴버니까 이런 공포가 오는 거죠 근데 어 구글이 이제 100년 채권을 발행하기는 했지만 지금 하이퍼스케드 기업들의 자금 조달 방식은 정상적인 채권 발행입니다</w:t>
+              <w:t>구글이 이제 100년 채권을 발행하기는 했지만 지금 하이퍼스케드 기업들의 자금 조달 방식은 정상적인 채권 발행입니다</w:t>
             </w:r>
           </w:p>
         </w:tc>
@@ -763,7 +1508,7 @@
                 <w:color w:val="1A1A1A"/>
                 <w:sz w:val="17"/>
               </w:rPr>
-              <w:t>이번 사이클에서도 소재 로테이션을 판단하려면 디램과 랜드 가격보다는 기존의 패 가동률과 신규 생산이 커지는지를 확인하라고 조언했습니다 LS 증권은 소재주에 주목할 시점은 2028년 2029년</w:t>
+              <w:t>사이클에서도 소재 로테이션을 판단하려면 디램과 랜드 가격보다는 기존의 패 가동률과 신규 생산이 커지는지를 확인하라고 조언했습니다 LS</w:t>
             </w:r>
           </w:p>
         </w:tc>
@@ -834,7 +1579,7 @@
                 <w:color w:val="1A1A1A"/>
                 <w:sz w:val="17"/>
               </w:rPr>
-              <w:t>오를 때 매수하고 내려갈 때 손절하면 그 업박지 한 세 번 정도를 타시면 거의 그냥 멘탈이 나갑니다 왜냐면 하락 구간은 그래도 인정할 수 있거든요 근데이 구간에서 지수는 계속 왔다 갔다 갔다 결국은 제</w:t>
+              <w:t>오를 때 매수하고 내려갈 때 손절하면 그 업박지 한 세 번 정도를 타시면 거의 그냥 멘탈이 나갑니다</w:t>
             </w:r>
           </w:p>
         </w:tc>
@@ -905,7 +1650,7 @@
                 <w:color w:val="1A1A1A"/>
                 <w:sz w:val="17"/>
               </w:rPr>
-              <w:t>한미반도체가 반도체 장비 수주 소식을 공개하면서 상승 마감했습니다 한미 반도체는 싱가포르 반도체 후공정 전문 기업이죠 UTC의 태국 법인으로부터 78억 7천만 원 규모의 장비를</w:t>
+              <w:t>한미반도체가 반도체 장비 수주 소식을 공개하면서 상승 마감했습니다 한미 반도체는 싱가포르 반도체 후공정 전문 기업이죠 UTC의 태국</w:t>
             </w:r>
           </w:p>
         </w:tc>
@@ -1944,7 +2689,7 @@
                 <w:color w:val="B8943A"/>
                 <w:sz w:val="20"/>
               </w:rPr>
-              <w:t xml:space="preserve">미는 말  </w:t>
+              <w:t xml:space="preserve">증류  </w:t>
             </w:r>
             <w:r>
               <w:rPr>
@@ -1953,12 +2698,26 @@
                 <w:color w:val="1A1A1A"/>
                 <w:sz w:val="22"/>
               </w:rPr>
-              <w:t>중요한 거는 금리의 레벨보단요 금리 이상의 성장이 나오느냐 안 나오냐 이게 더 중요한데 지금은 그걸 주도주들이 성장을 내고 있기 때문에 아직은 좀 견조하다 이렇게 봐야 될 것 같습니다</w:t>
+              <w:t>금리의 레벨보단요 금리 이상의 성장이 나오느냐 안 나오냐 이게 더 중요한데 지금은 그걸 주도주들이 성장을 내고 있기 때문에 아직은 좀</w:t>
             </w:r>
           </w:p>
         </w:tc>
       </w:tr>
     </w:tbl>
+    <w:p>
+      <w:pPr>
+        <w:spacing w:after="40" w:before="0" w:line="276" w:lineRule="auto"/>
+      </w:pPr>
+      <w:r>
+        <w:rPr>
+          <w:rFonts w:ascii="맑은 고딕" w:hAnsi="맑은 고딕" w:eastAsia="맑은 고딕"/>
+          <w:b w:val="0"/>
+          <w:color w:val="4B5563"/>
+          <w:sz w:val="20"/>
+        </w:rPr>
+        <w:t>받아쓴 말  ·  중요한 거는 금리의 레벨보단요 금리 이상의 성장이 나오느냐 안 나오냐 이게 더 중요한데 지금은 그걸 주도주들이 성장을 내고 있기 때문에 아직은 좀 견조하다 이렇게 봐야 될 것 같습니다</w:t>
+      </w:r>
+    </w:p>
     <w:p>
       <w:pPr>
         <w:spacing w:after="40" w:before="0" w:line="276" w:lineRule="auto"/>
@@ -2047,7 +2806,7 @@
                 <w:color w:val="B8943A"/>
                 <w:sz w:val="20"/>
               </w:rPr>
-              <w:t xml:space="preserve">미는 말  </w:t>
+              <w:t xml:space="preserve">증류  </w:t>
             </w:r>
             <w:r>
               <w:rPr>
@@ -2056,12 +2815,26 @@
                 <w:color w:val="1A1A1A"/>
                 <w:sz w:val="22"/>
               </w:rPr>
-              <w:t>결국에는 유가가 안정화되면 금리가 안정화되고 그리고 주식 시장이 반등이 가능할 수 있다는 걸 다시 한번 확인할 수 있었던 장이었습니다</w:t>
+              <w:t>결국에는 유가가 안정화되면 금리가 안정화되고</w:t>
             </w:r>
           </w:p>
         </w:tc>
       </w:tr>
     </w:tbl>
+    <w:p>
+      <w:pPr>
+        <w:spacing w:after="40" w:before="0" w:line="276" w:lineRule="auto"/>
+      </w:pPr>
+      <w:r>
+        <w:rPr>
+          <w:rFonts w:ascii="맑은 고딕" w:hAnsi="맑은 고딕" w:eastAsia="맑은 고딕"/>
+          <w:b w:val="0"/>
+          <w:color w:val="4B5563"/>
+          <w:sz w:val="20"/>
+        </w:rPr>
+        <w:t>받아쓴 말  ·  결국에는 유가가 안정화되면 금리가 안정화되고 그리고 주식 시장이 반등이 가능할 수 있다는 걸 다시 한번 확인할 수 있었던 장이었습니다</w:t>
+      </w:r>
+    </w:p>
     <w:p>
       <w:pPr>
         <w:spacing w:after="80" w:before="240" w:line="276" w:lineRule="auto"/>
@@ -2108,7 +2881,7 @@
                 <w:color w:val="B8943A"/>
                 <w:sz w:val="20"/>
               </w:rPr>
-              <w:t xml:space="preserve">미는 말  </w:t>
+              <w:t xml:space="preserve">증류  </w:t>
             </w:r>
             <w:r>
               <w:rPr>
@@ -2117,12 +2890,26 @@
                 <w:color w:val="1A1A1A"/>
                 <w:sz w:val="22"/>
               </w:rPr>
-              <w:t>하지만 삼성전자가 배당락을 이겨내며 저가 매수세가 유입됐고요 코스닥은 반도체 소부장 기업들의 수급이 강하게 유입되고 일부 시가 총액 상위 종목들 헬스케어 대표주가 선방하면서 지수 양전에</w:t>
+              <w:t>삼성전자가 배당락을 이겨내며 저가 매수세가 유입됐고요 코스닥은 반도체 소부장 기업들의 수급이 강하게 유입되고 일부 시가 총액 상위</w:t>
             </w:r>
           </w:p>
         </w:tc>
       </w:tr>
     </w:tbl>
+    <w:p>
+      <w:pPr>
+        <w:spacing w:after="40" w:before="0" w:line="276" w:lineRule="auto"/>
+      </w:pPr>
+      <w:r>
+        <w:rPr>
+          <w:rFonts w:ascii="맑은 고딕" w:hAnsi="맑은 고딕" w:eastAsia="맑은 고딕"/>
+          <w:b w:val="0"/>
+          <w:color w:val="4B5563"/>
+          <w:sz w:val="20"/>
+        </w:rPr>
+        <w:t>받아쓴 말  ·  하지만 삼성전자가 배당락을 이겨내며 저가 매수세가 유입됐고요 코스닥은 반도체 소부장 기업들의 수급이 강하게 유입되고 일부 시가 총액 상위 종목들 헬스케어 대표주가 선방하면서 지수 양전에</w:t>
+      </w:r>
+    </w:p>
     <w:p>
       <w:pPr>
         <w:spacing w:after="40" w:before="0" w:line="276" w:lineRule="auto"/>
@@ -2211,7 +2998,7 @@
                 <w:color w:val="B8943A"/>
                 <w:sz w:val="20"/>
               </w:rPr>
-              <w:t xml:space="preserve">미는 말  </w:t>
+              <w:t xml:space="preserve">증류  </w:t>
             </w:r>
             <w:r>
               <w:rPr>
@@ -2226,6 +3013,20 @@
         </w:tc>
       </w:tr>
     </w:tbl>
+    <w:p>
+      <w:pPr>
+        <w:spacing w:after="40" w:before="0" w:line="276" w:lineRule="auto"/>
+      </w:pPr>
+      <w:r>
+        <w:rPr>
+          <w:rFonts w:ascii="맑은 고딕" w:hAnsi="맑은 고딕" w:eastAsia="맑은 고딕"/>
+          <w:b w:val="0"/>
+          <w:color w:val="4B5563"/>
+          <w:sz w:val="20"/>
+        </w:rPr>
+        <w:t>받아쓴 말  ·  결국 지금 AI 산업에서는 더 빨리 가야한다는 경쟁과 속도를 조절해야 한다는 경고가 동시에 나오고 있습니다</w:t>
+      </w:r>
+    </w:p>
     <w:p>
       <w:pPr>
         <w:spacing w:after="40" w:before="0" w:line="276" w:lineRule="auto"/>
@@ -2314,7 +3115,7 @@
                 <w:color w:val="B8943A"/>
                 <w:sz w:val="20"/>
               </w:rPr>
-              <w:t xml:space="preserve">미는 말  </w:t>
+              <w:t xml:space="preserve">증류  </w:t>
             </w:r>
             <w:r>
               <w:rPr>
@@ -2323,12 +3124,26 @@
                 <w:color w:val="1A1A1A"/>
                 <w:sz w:val="22"/>
               </w:rPr>
-              <w:t>보면 두 회사 모두 지금 너무 없어서 못 팔고 좋은데 시장에서만 너무 냉담한 거니까 이게 수급상의 문제가 아니냐 이런 얘기들을 계속 하는 거죠</w:t>
+              <w:t>두 회사 모두 지금 너무 없어서 못 팔고 좋은데 시장에서만 너무 냉담한 거니까 이게 수급상의 문제가 아니냐 이런 얘기들을 계속 하는 거죠</w:t>
             </w:r>
           </w:p>
         </w:tc>
       </w:tr>
     </w:tbl>
+    <w:p>
+      <w:pPr>
+        <w:spacing w:after="40" w:before="0" w:line="276" w:lineRule="auto"/>
+      </w:pPr>
+      <w:r>
+        <w:rPr>
+          <w:rFonts w:ascii="맑은 고딕" w:hAnsi="맑은 고딕" w:eastAsia="맑은 고딕"/>
+          <w:b w:val="0"/>
+          <w:color w:val="4B5563"/>
+          <w:sz w:val="20"/>
+        </w:rPr>
+        <w:t>받아쓴 말  ·  보면 두 회사 모두 지금 너무 없어서 못 팔고 좋은데 시장에서만 너무 냉담한 거니까 이게 수급상의 문제가 아니냐 이런 얘기들을 계속 하는 거죠</w:t>
+      </w:r>
+    </w:p>
     <w:p>
       <w:pPr>
         <w:spacing w:after="40" w:before="0" w:line="276" w:lineRule="auto"/>
@@ -2403,7 +3218,7 @@
                 <w:color w:val="B8943A"/>
                 <w:sz w:val="20"/>
               </w:rPr>
-              <w:t xml:space="preserve">미는 말  </w:t>
+              <w:t xml:space="preserve">증류  </w:t>
             </w:r>
             <w:r>
               <w:rPr>
@@ -2412,12 +3227,26 @@
                 <w:color w:val="1A1A1A"/>
                 <w:sz w:val="22"/>
               </w:rPr>
-              <w:t>이제는 키포인트가 HBM이라고 보세요 왜냐면 그동안 가격 상승을 이끌었던 건 최근에는 사실 범용 쪽이었고 범용 잘하는 친구들이 실적 쭉쭉 당겼었잖아요 근데 이제는 키가 HBM으로 넘어갔다</w:t>
+              <w:t>이제는 키가 HBM으로 넘어갔다</w:t>
             </w:r>
           </w:p>
         </w:tc>
       </w:tr>
     </w:tbl>
+    <w:p>
+      <w:pPr>
+        <w:spacing w:after="40" w:before="0" w:line="276" w:lineRule="auto"/>
+      </w:pPr>
+      <w:r>
+        <w:rPr>
+          <w:rFonts w:ascii="맑은 고딕" w:hAnsi="맑은 고딕" w:eastAsia="맑은 고딕"/>
+          <w:b w:val="0"/>
+          <w:color w:val="4B5563"/>
+          <w:sz w:val="20"/>
+        </w:rPr>
+        <w:t>받아쓴 말  ·  이제는 키포인트가 HBM이라고 보세요 왜냐면 그동안 가격 상승을 이끌었던 건 최근에는 사실 범용 쪽이었고 범용 잘하는 친구들이 실적 쭉쭉 당겼었잖아요 근데 이제는 키가 HBM으로 넘어갔다</w:t>
+      </w:r>
+    </w:p>
     <w:p>
       <w:pPr>
         <w:spacing w:after="40" w:before="0" w:line="276" w:lineRule="auto"/>
@@ -2506,7 +3335,7 @@
                 <w:color w:val="B8943A"/>
                 <w:sz w:val="20"/>
               </w:rPr>
-              <w:t xml:space="preserve">미는 말  </w:t>
+              <w:t xml:space="preserve">증류  </w:t>
             </w:r>
             <w:r>
               <w:rPr>
@@ -2515,12 +3344,26 @@
                 <w:color w:val="1A1A1A"/>
                 <w:sz w:val="22"/>
               </w:rPr>
-              <w:t>아니라 빅테크 기업에 공급하는 B2B 가격이거든요 그니까 B2B 가격의 장기 계약이라고 하면 우리가 교과서적으로 얘기하면 PER 평가가 맞아요</w:t>
+              <w:t>빅테크 기업에 공급하는 B2B 가격이거든요 그니까 B2B 가격의 장기 계약이라고 하면 우리가 교과서적으로 얘기하면 PER 평가가 맞아요</w:t>
             </w:r>
           </w:p>
         </w:tc>
       </w:tr>
     </w:tbl>
+    <w:p>
+      <w:pPr>
+        <w:spacing w:after="40" w:before="0" w:line="276" w:lineRule="auto"/>
+      </w:pPr>
+      <w:r>
+        <w:rPr>
+          <w:rFonts w:ascii="맑은 고딕" w:hAnsi="맑은 고딕" w:eastAsia="맑은 고딕"/>
+          <w:b w:val="0"/>
+          <w:color w:val="4B5563"/>
+          <w:sz w:val="20"/>
+        </w:rPr>
+        <w:t>받아쓴 말  ·  아니라 빅테크 기업에 공급하는 B2B 가격이거든요 그니까 B2B 가격의 장기 계약이라고 하면 우리가 교과서적으로 얘기하면 PER 평가가 맞아요</w:t>
+      </w:r>
+    </w:p>
     <w:p>
       <w:pPr>
         <w:spacing w:after="40" w:before="0" w:line="276" w:lineRule="auto"/>
@@ -2595,7 +3438,7 @@
                 <w:color w:val="B8943A"/>
                 <w:sz w:val="20"/>
               </w:rPr>
-              <w:t xml:space="preserve">미는 말  </w:t>
+              <w:t xml:space="preserve">증류  </w:t>
             </w:r>
             <w:r>
               <w:rPr>
@@ -2604,12 +3447,26 @@
                 <w:color w:val="1A1A1A"/>
                 <w:sz w:val="22"/>
               </w:rPr>
-              <w:t>돈을 빌리는데 문제가 생기면 다컴버니까 이런 공포가 오는 거죠 근데 어 구글이 이제 100년 채권을 발행하기는 했지만 지금 하이퍼스케드 기업들의 자금 조달 방식은 정상적인 채권 발행입니다</w:t>
+              <w:t>구글이 이제 100년 채권을 발행하기는 했지만 지금 하이퍼스케드 기업들의 자금 조달 방식은 정상적인 채권 발행입니다</w:t>
             </w:r>
           </w:p>
         </w:tc>
       </w:tr>
     </w:tbl>
+    <w:p>
+      <w:pPr>
+        <w:spacing w:after="40" w:before="0" w:line="276" w:lineRule="auto"/>
+      </w:pPr>
+      <w:r>
+        <w:rPr>
+          <w:rFonts w:ascii="맑은 고딕" w:hAnsi="맑은 고딕" w:eastAsia="맑은 고딕"/>
+          <w:b w:val="0"/>
+          <w:color w:val="4B5563"/>
+          <w:sz w:val="20"/>
+        </w:rPr>
+        <w:t>받아쓴 말  ·  돈을 빌리는데 문제가 생기면 다컴버니까 이런 공포가 오는 거죠 근데 어 구글이 이제 100년 채권을 발행하기는 했지만 지금 하이퍼스케드 기업들의 자금 조달 방식은 정상적인 채권 발행입니다</w:t>
+      </w:r>
+    </w:p>
     <w:p>
       <w:pPr>
         <w:spacing w:after="40" w:before="0" w:line="276" w:lineRule="auto"/>
@@ -2684,7 +3541,7 @@
                 <w:color w:val="B8943A"/>
                 <w:sz w:val="20"/>
               </w:rPr>
-              <w:t xml:space="preserve">미는 말  </w:t>
+              <w:t xml:space="preserve">증류  </w:t>
             </w:r>
             <w:r>
               <w:rPr>
@@ -2693,12 +3550,26 @@
                 <w:color w:val="1A1A1A"/>
                 <w:sz w:val="22"/>
               </w:rPr>
-              <w:t>이번 사이클에서도 소재 로테이션을 판단하려면 디램과 랜드 가격보다는 기존의 패 가동률과 신규 생산이 커지는지를 확인하라고 조언했습니다 LS 증권은 소재주에 주목할 시점은 2028년 2029년</w:t>
+              <w:t>사이클에서도 소재 로테이션을 판단하려면 디램과 랜드 가격보다는 기존의 패 가동률과 신규 생산이 커지는지를 확인하라고 조언했습니다 LS</w:t>
             </w:r>
           </w:p>
         </w:tc>
       </w:tr>
     </w:tbl>
+    <w:p>
+      <w:pPr>
+        <w:spacing w:after="40" w:before="0" w:line="276" w:lineRule="auto"/>
+      </w:pPr>
+      <w:r>
+        <w:rPr>
+          <w:rFonts w:ascii="맑은 고딕" w:hAnsi="맑은 고딕" w:eastAsia="맑은 고딕"/>
+          <w:b w:val="0"/>
+          <w:color w:val="4B5563"/>
+          <w:sz w:val="20"/>
+        </w:rPr>
+        <w:t>받아쓴 말  ·  이번 사이클에서도 소재 로테이션을 판단하려면 디램과 랜드 가격보다는 기존의 패 가동률과 신규 생산이 커지는지를 확인하라고 조언했습니다 LS 증권은 소재주에 주목할 시점은 2028년 2029년</w:t>
+      </w:r>
+    </w:p>
     <w:p>
       <w:pPr>
         <w:spacing w:after="40" w:before="0" w:line="276" w:lineRule="auto"/>
@@ -2787,7 +3658,7 @@
                 <w:color w:val="B8943A"/>
                 <w:sz w:val="20"/>
               </w:rPr>
-              <w:t xml:space="preserve">미는 말  </w:t>
+              <w:t xml:space="preserve">증류  </w:t>
             </w:r>
             <w:r>
               <w:rPr>
@@ -2796,12 +3667,26 @@
                 <w:color w:val="1A1A1A"/>
                 <w:sz w:val="22"/>
               </w:rPr>
-              <w:t>오를 때 매수하고 내려갈 때 손절하면 그 업박지 한 세 번 정도를 타시면 거의 그냥 멘탈이 나갑니다 왜냐면 하락 구간은 그래도 인정할 수 있거든요 근데이 구간에서 지수는 계속 왔다 갔다 갔다 결국은 제</w:t>
+              <w:t>오를 때 매수하고 내려갈 때 손절하면 그 업박지 한 세 번 정도를 타시면 거의 그냥 멘탈이 나갑니다</w:t>
             </w:r>
           </w:p>
         </w:tc>
       </w:tr>
     </w:tbl>
+    <w:p>
+      <w:pPr>
+        <w:spacing w:after="40" w:before="0" w:line="276" w:lineRule="auto"/>
+      </w:pPr>
+      <w:r>
+        <w:rPr>
+          <w:rFonts w:ascii="맑은 고딕" w:hAnsi="맑은 고딕" w:eastAsia="맑은 고딕"/>
+          <w:b w:val="0"/>
+          <w:color w:val="4B5563"/>
+          <w:sz w:val="20"/>
+        </w:rPr>
+        <w:t>받아쓴 말  ·  오를 때 매수하고 내려갈 때 손절하면 그 업박지 한 세 번 정도를 타시면 거의 그냥 멘탈이 나갑니다 왜냐면 하락 구간은 그래도 인정할 수 있거든요 근데이 구간에서 지수는 계속 왔다 갔다 갔다 결국은 제</w:t>
+      </w:r>
+    </w:p>
     <w:p>
       <w:pPr>
         <w:spacing w:after="40" w:before="0" w:line="276" w:lineRule="auto"/>
@@ -2890,7 +3775,7 @@
                 <w:color w:val="B8943A"/>
                 <w:sz w:val="20"/>
               </w:rPr>
-              <w:t xml:space="preserve">미는 말  </w:t>
+              <w:t xml:space="preserve">증류  </w:t>
             </w:r>
             <w:r>
               <w:rPr>
@@ -2899,12 +3784,26 @@
                 <w:color w:val="1A1A1A"/>
                 <w:sz w:val="22"/>
               </w:rPr>
-              <w:t>한미반도체가 반도체 장비 수주 소식을 공개하면서 상승 마감했습니다 한미 반도체는 싱가포르 반도체 후공정 전문 기업이죠 UTC의 태국 법인으로부터 78억 7천만 원 규모의 장비를</w:t>
+              <w:t>한미반도체가 반도체 장비 수주 소식을 공개하면서 상승 마감했습니다 한미 반도체는 싱가포르 반도체 후공정 전문 기업이죠 UTC의 태국</w:t>
             </w:r>
           </w:p>
         </w:tc>
       </w:tr>
     </w:tbl>
+    <w:p>
+      <w:pPr>
+        <w:spacing w:after="40" w:before="0" w:line="276" w:lineRule="auto"/>
+      </w:pPr>
+      <w:r>
+        <w:rPr>
+          <w:rFonts w:ascii="맑은 고딕" w:hAnsi="맑은 고딕" w:eastAsia="맑은 고딕"/>
+          <w:b w:val="0"/>
+          <w:color w:val="4B5563"/>
+          <w:sz w:val="20"/>
+        </w:rPr>
+        <w:t>받아쓴 말  ·  한미반도체가 반도체 장비 수주 소식을 공개하면서 상승 마감했습니다 한미 반도체는 싱가포르 반도체 후공정 전문 기업이죠 UTC의 태국 법인으로부터 78억 7천만 원 규모의 장비를</w:t>
+      </w:r>
+    </w:p>
     <w:p>
       <w:pPr>
         <w:spacing w:after="40" w:before="0" w:line="276" w:lineRule="auto"/>

</xml_diff>